<commit_message>
Clarify agreement drafts as starting templates and add a home icon off the landing page.
</commit_message>
<xml_diff>
--- a/public/legal-templates/appliance-handover-checklist.docx
+++ b/public/legal-templates/appliance-handover-checklist.docx
@@ -4,19 +4,13 @@
   <w:body>
     <w:p>
       <w:pPr>
-        <w:pStyle w:val="Heading1"/>
         <w:jc w:val="center"/>
       </w:pPr>
       <w:r>
-        <w:t>RENTITOUT TEMPLATE</w:t>
-      </w:r>
-    </w:p>
-    <w:p>
-      <w:pPr>
-        <w:pStyle w:val="Heading2"/>
-        <w:jc w:val="center"/>
-      </w:pPr>
-      <w:r>
+        <w:rPr>
+          <w:b/>
+          <w:sz w:val="32"/>
+        </w:rPr>
         <w:t>APPLIANCE HANDOVER AND CONDITION CHECKLIST</w:t>
       </w:r>
     </w:p>
@@ -25,501 +19,541 @@
         <w:jc w:val="center"/>
       </w:pPr>
       <w:r>
-        <w:t>Version Date: May 11, 2026</w:t>
+        <w:rPr>
+          <w:i/>
+          <w:sz w:val="20"/>
+        </w:rPr>
+        <w:t>Annexure / Schedule for Movable Appliance Rentals</w:t>
       </w:r>
     </w:p>
-    <w:p/>
-    <w:p/>
-    <w:p>
-      <w:r>
-        <w:t>This checklist should be attached to the rental agreement and signed at both handover and return.</w:t>
-      </w:r>
-    </w:p>
-    <w:p/>
     <w:p>
       <w:pPr>
-        <w:pStyle w:val="Heading2"/>
+        <w:spacing w:before="240" w:after="80"/>
       </w:pPr>
       <w:r>
-        <w:t>A) AGREEMENT REFERENCE</w:t>
+        <w:rPr>
+          <w:b/>
+          <w:sz w:val="24"/>
+        </w:rPr>
+        <w:t>IMPORTANT NOTICE</w:t>
       </w:r>
     </w:p>
     <w:p>
       <w:r>
-        <w:t>Agreement Date: [DATE]</w:t>
+        <w:t>This document is an editable starting draft provided by RentItOut for convenience only. It is not legal advice, not a lawyer-reviewed instrument for your state, and not a guarantee of stamp-duty compliance, registration, insurance cover, or enforceability. RentItOut is only a connector marketplace and is not a party to this rental. Both parties should fill every blank, attach supporting records, and obtain advice from a qualified advocate before signing.</w:t>
       </w:r>
     </w:p>
     <w:p>
       <w:r>
-        <w:t>Owner Name: [OWNER NAME]</w:t>
+        <w:t>Draft version date: October 8, 2026</w:t>
+      </w:r>
+    </w:p>
+    <w:p>
+      <w:pPr>
+        <w:spacing w:before="240" w:after="80"/>
+      </w:pPr>
+      <w:r>
+        <w:rPr>
+          <w:b/>
+          <w:sz w:val="24"/>
+        </w:rPr>
+        <w:t>1. REFERENCE</w:t>
       </w:r>
     </w:p>
     <w:p>
       <w:r>
-        <w:t>Renter Name: [RENTER NAME]</w:t>
+        <w:t>Linked agreement date: __________________________________________</w:t>
       </w:r>
     </w:p>
     <w:p>
       <w:r>
-        <w:t>Appliance: [CATEGORY + BRAND + MODEL]</w:t>
+        <w:t>Listing ID (if any): __________________________________________</w:t>
       </w:r>
     </w:p>
     <w:p>
       <w:r>
-        <w:t>Serial Number: [SERIAL NO.]</w:t>
-      </w:r>
-    </w:p>
-    <w:p/>
-    <w:p>
-      <w:pPr>
-        <w:pStyle w:val="Heading2"/>
-      </w:pPr>
-      <w:r>
-        <w:t>B) PRE-HANDOVER CHECK (OWNER + RENTER)</w:t>
+        <w:t>Owner name: __________________________________________</w:t>
       </w:r>
     </w:p>
     <w:p>
       <w:r>
-        <w:t>Date/Time: [DATE/TIME]</w:t>
+        <w:t>Renter name: __________________________________________</w:t>
       </w:r>
     </w:p>
     <w:p>
       <w:r>
-        <w:t>Location: [ADDRESS]</w:t>
+        <w:t>Handover date and time: __________________________________________</w:t>
       </w:r>
     </w:p>
-    <w:p/>
     <w:p>
       <w:r>
-        <w:t>Physical Condition</w:t>
+        <w:t>Return inspection date and time: __________________________________________</w:t>
+      </w:r>
+    </w:p>
+    <w:p>
+      <w:r>
+        <w:t>Location of inspection: __________________________________________</w:t>
       </w:r>
     </w:p>
     <w:p>
       <w:pPr>
-        <w:pStyle w:val="ListBullet"/>
+        <w:spacing w:before="240" w:after="80"/>
       </w:pPr>
       <w:r>
-        <w:t>[ ] Outer body has no major cracks</w:t>
+        <w:rPr>
+          <w:b/>
+          <w:sz w:val="24"/>
+        </w:rPr>
+        <w:t>2. APPLIANCE IDENTITY</w:t>
+      </w:r>
+    </w:p>
+    <w:p>
+      <w:r>
+        <w:t>Category: __________________________________________</w:t>
+      </w:r>
+    </w:p>
+    <w:p>
+      <w:r>
+        <w:t>Brand and model: __________________________________________</w:t>
+      </w:r>
+    </w:p>
+    <w:p>
+      <w:r>
+        <w:t>Serial / manufacturer number: __________________________________________</w:t>
+      </w:r>
+    </w:p>
+    <w:p>
+      <w:r>
+        <w:t>Colour / capacity / size: __________________________________________</w:t>
+      </w:r>
+    </w:p>
+    <w:p>
+      <w:r>
+        <w:t>Power rating / gas type if relevant: __________________________________________</w:t>
       </w:r>
     </w:p>
     <w:p>
       <w:pPr>
-        <w:pStyle w:val="ListBullet"/>
+        <w:spacing w:before="240" w:after="80"/>
       </w:pPr>
       <w:r>
-        <w:t>[ ] Display panel/buttons working</w:t>
+        <w:rPr>
+          <w:b/>
+          <w:sz w:val="24"/>
+        </w:rPr>
+        <w:t>3. ACCESSORIES AT HANDOVER</w:t>
+      </w:r>
+    </w:p>
+    <w:p>
+      <w:r>
+        <w:t>Mark Yes / No / Not applicable, and count where needed.</w:t>
+      </w:r>
+    </w:p>
+    <w:p>
+      <w:r>
+        <w:t>Remote control: Yes / No / N/A    Qty: ____    Condition: ____________________</w:t>
+      </w:r>
+    </w:p>
+    <w:p>
+      <w:r>
+        <w:t>Power cord / adapter: Yes / No / N/A    Qty: ____    Condition: ____________________</w:t>
+      </w:r>
+    </w:p>
+    <w:p>
+      <w:r>
+        <w:t>Stand / base / wall brackets: Yes / No / N/A    Qty: ____    Condition: ____________________</w:t>
+      </w:r>
+    </w:p>
+    <w:p>
+      <w:r>
+        <w:t>Filters / trays / detachable parts: Yes / No / N/A    Qty: ____    Condition: ____________________</w:t>
+      </w:r>
+    </w:p>
+    <w:p>
+      <w:r>
+        <w:t>User manual: Yes / No / N/A    Qty: ____    Condition: ____________________</w:t>
+      </w:r>
+    </w:p>
+    <w:p>
+      <w:r>
+        <w:t>Warranty card / invoice copy: Yes / No / N/A    Qty: ____    Condition: ____________________</w:t>
+      </w:r>
+    </w:p>
+    <w:p>
+      <w:r>
+        <w:t>Other: [DESCRIBE]: Yes / No / N/A    Qty: ____    Condition: ____________________</w:t>
       </w:r>
     </w:p>
     <w:p>
       <w:pPr>
-        <w:pStyle w:val="ListBullet"/>
+        <w:spacing w:before="240" w:after="80"/>
       </w:pPr>
       <w:r>
-        <w:t>[ ] Power cable and plug intact</w:t>
+        <w:rPr>
+          <w:b/>
+          <w:sz w:val="24"/>
+        </w:rPr>
+        <w:t>4. WORKING CHECK AT HANDOVER</w:t>
+      </w:r>
+    </w:p>
+    <w:p>
+      <w:r>
+        <w:t>Powers on: Pass / Fail / N/A    Notes: ____________________</w:t>
+      </w:r>
+    </w:p>
+    <w:p>
+      <w:r>
+        <w:t>Primary function works (cooling / washing / heating / etc.): Pass / Fail / N/A    Notes: ____________________</w:t>
+      </w:r>
+    </w:p>
+    <w:p>
+      <w:r>
+        <w:t>Unusual noise: Pass / Fail / N/A    Notes: ____________________</w:t>
+      </w:r>
+    </w:p>
+    <w:p>
+      <w:r>
+        <w:t>Leakage / rust / cracks: Pass / Fail / N/A    Notes: ____________________</w:t>
+      </w:r>
+    </w:p>
+    <w:p>
+      <w:r>
+        <w:t>Display / lights / buttons work: Pass / Fail / N/A    Notes: ____________________</w:t>
+      </w:r>
+    </w:p>
+    <w:p>
+      <w:r>
+        <w:t>Remote / controls work: Pass / Fail / N/A    Notes: ____________________</w:t>
+      </w:r>
+    </w:p>
+    <w:p>
+      <w:r>
+        <w:t>Safety cut-off / door lock works if applicable: Pass / Fail / N/A    Notes: ____________________</w:t>
       </w:r>
     </w:p>
     <w:p>
       <w:pPr>
-        <w:pStyle w:val="ListBullet"/>
+        <w:spacing w:before="240" w:after="80"/>
       </w:pPr>
       <w:r>
-        <w:t>[ ] Doors/lids/hinges handle properly</w:t>
+        <w:rPr>
+          <w:b/>
+          <w:sz w:val="24"/>
+        </w:rPr>
+        <w:t>5. VISIBLE CONDITION AT HANDOVER</w:t>
+      </w:r>
+    </w:p>
+    <w:p>
+      <w:r>
+        <w:t>Scratches / dents / stains: __________________________________________</w:t>
+      </w:r>
+    </w:p>
+    <w:p>
+      <w:r>
+        <w:t>Pre-existing defects disclosed: __________________________________________</w:t>
+      </w:r>
+    </w:p>
+    <w:p>
+      <w:r>
+        <w:t>Overall condition rating (Excellent / Good / Fair / Poor): __________________________________________</w:t>
+      </w:r>
+    </w:p>
+    <w:p>
+      <w:r>
+        <w:t>Photo set taken at handover (tick): front [ ] back [ ] sides [ ] serial label [ ] accessories [ ] defects [ ]</w:t>
+      </w:r>
+    </w:p>
+    <w:p>
+      <w:r>
+        <w:t>Photo file names or album reference: __________________________________________</w:t>
       </w:r>
     </w:p>
     <w:p>
       <w:pPr>
-        <w:pStyle w:val="ListBullet"/>
+        <w:spacing w:before="240" w:after="80"/>
       </w:pPr>
       <w:r>
-        <w:t>[ ] No unusual rust/leak marks</w:t>
+        <w:rPr>
+          <w:b/>
+          <w:sz w:val="24"/>
+        </w:rPr>
+        <w:t>6. METER / READING / SETTINGS IF RELEVANT</w:t>
+      </w:r>
+    </w:p>
+    <w:p>
+      <w:r>
+        <w:t>Any meter reading / cycle count / hours: __________________________________________</w:t>
+      </w:r>
+    </w:p>
+    <w:p>
+      <w:r>
+        <w:t>Installed settings noted: __________________________________________</w:t>
       </w:r>
     </w:p>
     <w:p>
       <w:pPr>
-        <w:pStyle w:val="ListBullet"/>
+        <w:spacing w:before="240" w:after="80"/>
       </w:pPr>
       <w:r>
-        <w:t>[ ] No foul smell or burn marks</w:t>
+        <w:rPr>
+          <w:b/>
+          <w:sz w:val="24"/>
+        </w:rPr>
+        <w:t>7. HANDOVER DECLARATION</w:t>
       </w:r>
     </w:p>
-    <w:p/>
     <w:p>
       <w:r>
-        <w:t>Functional Check</w:t>
+        <w:t>The Owner confirms the Appliance and listed accessories were handed over as recorded above. The Renter confirms opportunity to inspect and accepts the Appliance in the recorded condition, subject to latent defects not reasonably visible on inspection.</w:t>
       </w:r>
     </w:p>
     <w:p>
       <w:pPr>
-        <w:pStyle w:val="ListBullet"/>
+        <w:spacing w:before="240" w:after="80"/>
       </w:pPr>
       <w:r>
-        <w:t>[ ] Powers on normally</w:t>
+        <w:rPr>
+          <w:b/>
+          <w:sz w:val="24"/>
+        </w:rPr>
+        <w:t>OWNER SIGN-OFF AT HANDOVER</w:t>
+      </w:r>
+    </w:p>
+    <w:p>
+      <w:r>
+        <w:t>Signature: __________________________________________</w:t>
+      </w:r>
+    </w:p>
+    <w:p>
+      <w:r>
+        <w:t>Full name: __________________________________________</w:t>
+      </w:r>
+    </w:p>
+    <w:p>
+      <w:r>
+        <w:t>Date: __________________________________________</w:t>
+      </w:r>
+    </w:p>
+    <w:p>
+      <w:r>
+        <w:t>Place: __________________________________________</w:t>
       </w:r>
     </w:p>
     <w:p>
       <w:pPr>
-        <w:pStyle w:val="ListBullet"/>
+        <w:spacing w:before="240" w:after="80"/>
       </w:pPr>
       <w:r>
-        <w:t>[ ] Basic function test completed</w:t>
+        <w:rPr>
+          <w:b/>
+          <w:sz w:val="24"/>
+        </w:rPr>
+        <w:t>RENTER SIGN-OFF AT HANDOVER</w:t>
+      </w:r>
+    </w:p>
+    <w:p>
+      <w:r>
+        <w:t>Signature: __________________________________________</w:t>
+      </w:r>
+    </w:p>
+    <w:p>
+      <w:r>
+        <w:t>Full name: __________________________________________</w:t>
+      </w:r>
+    </w:p>
+    <w:p>
+      <w:r>
+        <w:t>Date: __________________________________________</w:t>
+      </w:r>
+    </w:p>
+    <w:p>
+      <w:r>
+        <w:t>Place: __________________________________________</w:t>
       </w:r>
     </w:p>
     <w:p>
       <w:pPr>
-        <w:pStyle w:val="ListBullet"/>
+        <w:spacing w:before="240" w:after="80"/>
       </w:pPr>
       <w:r>
-        <w:t>[ ] Noise/vibration level acceptable</w:t>
+        <w:rPr>
+          <w:b/>
+          <w:sz w:val="24"/>
+        </w:rPr>
+        <w:t>8. RETURN INSPECTION</w:t>
+      </w:r>
+    </w:p>
+    <w:p>
+      <w:r>
+        <w:t>Complete this section only at return.</w:t>
+      </w:r>
+    </w:p>
+    <w:p>
+      <w:r>
+        <w:t>Appliance returned on time: Yes / No / N/A    Notes: ____________________</w:t>
+      </w:r>
+    </w:p>
+    <w:p>
+      <w:r>
+        <w:t>All listed accessories returned: Yes / No / N/A    Notes: ____________________</w:t>
+      </w:r>
+    </w:p>
+    <w:p>
+      <w:r>
+        <w:t>Working condition compared with handover: Yes / No / N/A    Notes: ____________________</w:t>
+      </w:r>
+    </w:p>
+    <w:p>
+      <w:r>
+        <w:t>New damage beyond ordinary wear and tear: Yes / No / N/A    Notes: ____________________</w:t>
+      </w:r>
+    </w:p>
+    <w:p>
+      <w:r>
+        <w:t>Cleaning condition acceptable: Yes / No / N/A    Notes: ____________________</w:t>
+      </w:r>
+    </w:p>
+    <w:p>
+      <w:r>
+        <w:t>Keys / remotes / manuals returned: Yes / No / N/A    Notes: ____________________</w:t>
+      </w:r>
+    </w:p>
+    <w:p>
+      <w:r>
+        <w:t>New defects or missing items: __________________________________________</w:t>
+      </w:r>
+    </w:p>
+    <w:p>
+      <w:r>
+        <w:t>Estimated deduction discussion (INR), if any: __________________________________________</w:t>
+      </w:r>
+    </w:p>
+    <w:p>
+      <w:r>
+        <w:t>Deposit return timeline agreed: __________________________________________</w:t>
+      </w:r>
+    </w:p>
+    <w:p>
+      <w:r>
+        <w:t>Return photo set taken (tick): front [ ] back [ ] sides [ ] serial label [ ] accessories [ ] new defects [ ]</w:t>
       </w:r>
     </w:p>
     <w:p>
       <w:pPr>
-        <w:pStyle w:val="ListBullet"/>
+        <w:spacing w:before="240" w:after="80"/>
       </w:pPr>
       <w:r>
-        <w:t>[ ] Safety features present and functional</w:t>
+        <w:rPr>
+          <w:b/>
+          <w:sz w:val="24"/>
+        </w:rPr>
+        <w:t>9. RETURN DECLARATION</w:t>
       </w:r>
     </w:p>
-    <w:p/>
     <w:p>
       <w:r>
-        <w:t>Accessories Provided</w:t>
+        <w:t>The Parties confirm the return inspection notes above. Any Deposit deduction must still follow the signed rental agreement and be supported by a written settlement note.</w:t>
       </w:r>
     </w:p>
     <w:p>
       <w:pPr>
-        <w:pStyle w:val="ListBullet"/>
+        <w:spacing w:before="240" w:after="80"/>
       </w:pPr>
       <w:r>
-        <w:t>[ ] Remote</w:t>
+        <w:rPr>
+          <w:b/>
+          <w:sz w:val="24"/>
+        </w:rPr>
+        <w:t>OWNER SIGN-OFF AT RETURN</w:t>
+      </w:r>
+    </w:p>
+    <w:p>
+      <w:r>
+        <w:t>Signature: __________________________________________</w:t>
+      </w:r>
+    </w:p>
+    <w:p>
+      <w:r>
+        <w:t>Full name: __________________________________________</w:t>
+      </w:r>
+    </w:p>
+    <w:p>
+      <w:r>
+        <w:t>Date: __________________________________________</w:t>
+      </w:r>
+    </w:p>
+    <w:p>
+      <w:r>
+        <w:t>Place: __________________________________________</w:t>
       </w:r>
     </w:p>
     <w:p>
       <w:pPr>
-        <w:pStyle w:val="ListBullet"/>
+        <w:spacing w:before="240" w:after="80"/>
       </w:pPr>
       <w:r>
-        <w:t>[ ] Adapter/Cable</w:t>
+        <w:rPr>
+          <w:b/>
+          <w:sz w:val="24"/>
+        </w:rPr>
+        <w:t>RENTER SIGN-OFF AT RETURN</w:t>
+      </w:r>
+    </w:p>
+    <w:p>
+      <w:r>
+        <w:t>Signature: __________________________________________</w:t>
+      </w:r>
+    </w:p>
+    <w:p>
+      <w:r>
+        <w:t>Full name: __________________________________________</w:t>
+      </w:r>
+    </w:p>
+    <w:p>
+      <w:r>
+        <w:t>Date: __________________________________________</w:t>
+      </w:r>
+    </w:p>
+    <w:p>
+      <w:r>
+        <w:t>Place: __________________________________________</w:t>
       </w:r>
     </w:p>
     <w:p>
       <w:pPr>
-        <w:pStyle w:val="ListBullet"/>
+        <w:spacing w:before="240" w:after="80"/>
       </w:pPr>
       <w:r>
-        <w:t>[ ] User manual</w:t>
-      </w:r>
-    </w:p>
-    <w:p>
-      <w:pPr>
-        <w:pStyle w:val="ListBullet"/>
-      </w:pPr>
-      <w:r>
-        <w:t>[ ] Inlet/Outlet pipes</w:t>
-      </w:r>
-    </w:p>
-    <w:p>
-      <w:pPr>
-        <w:pStyle w:val="ListBullet"/>
-      </w:pPr>
-      <w:r>
-        <w:t>[ ] Stand/base kit</w:t>
-      </w:r>
-    </w:p>
-    <w:p>
-      <w:pPr>
-        <w:pStyle w:val="ListBullet"/>
-      </w:pPr>
-      <w:r>
-        <w:t>[ ] Other: [LIST]</w:t>
-      </w:r>
-    </w:p>
-    <w:p/>
-    <w:p>
-      <w:r>
-        <w:t>Meter/Cycle/Runtime Reading (if applicable): [DETAILS]</w:t>
+        <w:rPr>
+          <w:b/>
+          <w:sz w:val="24"/>
+        </w:rPr>
+        <w:t>WITNESS (OPTIONAL)</w:t>
       </w:r>
     </w:p>
     <w:p>
       <w:r>
-        <w:t>Known defects at handover: [NONE / DETAILS]</w:t>
-      </w:r>
-    </w:p>
-    <w:p/>
-    <w:p>
-      <w:r>
-        <w:t>Photo Evidence</w:t>
+        <w:t>Signature: __________________________________________</w:t>
       </w:r>
     </w:p>
     <w:p>
       <w:r>
-        <w:rPr>
-          <w:b/>
-        </w:rPr>
-        <w:t>Photo file names/links:</w:t>
-      </w:r>
-    </w:p>
-    <w:p>
-      <w:pPr>
-        <w:pStyle w:val="Heading2"/>
-      </w:pPr>
-      <w:r>
-        <w:t>1. [PHOTO 1]</w:t>
-      </w:r>
-    </w:p>
-    <w:p>
-      <w:pPr>
-        <w:pStyle w:val="Heading2"/>
-      </w:pPr>
-      <w:r>
-        <w:t>2. [PHOTO 2]</w:t>
-      </w:r>
-    </w:p>
-    <w:p>
-      <w:pPr>
-        <w:pStyle w:val="Heading2"/>
-      </w:pPr>
-      <w:r>
-        <w:t>3. [PHOTO 3]</w:t>
-      </w:r>
-    </w:p>
-    <w:p>
-      <w:pPr>
-        <w:pStyle w:val="Heading2"/>
-      </w:pPr>
-      <w:r>
-        <w:t>4. [PHOTO 4]</w:t>
-      </w:r>
-    </w:p>
-    <w:p/>
-    <w:p>
-      <w:pPr>
-        <w:pStyle w:val="Heading2"/>
-      </w:pPr>
-      <w:r>
-        <w:t>C) DURING-TERM NOTES (OPTIONAL LOG)</w:t>
+        <w:t>Full name: __________________________________________</w:t>
       </w:r>
     </w:p>
     <w:p>
       <w:r>
-        <w:t>Service/repair event date: [DATE]</w:t>
+        <w:t>Date: __________________________________________</w:t>
       </w:r>
     </w:p>
     <w:p>
       <w:r>
-        <w:t>Issue reported: [DETAILS]</w:t>
+        <w:t>Place: __________________________________________</w:t>
       </w:r>
     </w:p>
-    <w:p>
-      <w:r>
-        <w:t>Service done by: [NAME/COMPANY]</w:t>
-      </w:r>
-    </w:p>
-    <w:p>
-      <w:r>
-        <w:t>Cost paid by: [OWNER/RENTER]</w:t>
-      </w:r>
-    </w:p>
-    <w:p>
-      <w:r>
-        <w:t>Notes: [DETAILS]</w:t>
-      </w:r>
-    </w:p>
-    <w:p/>
-    <w:p>
-      <w:pPr>
-        <w:pStyle w:val="Heading2"/>
-      </w:pPr>
-      <w:r>
-        <w:t>D) RETURN CHECK (OWNER + RENTER)</w:t>
-      </w:r>
-    </w:p>
-    <w:p>
-      <w:r>
-        <w:t>Return Date/Time: [DATE/TIME]</w:t>
-      </w:r>
-    </w:p>
-    <w:p>
-      <w:r>
-        <w:t>Return Location: [ADDRESS]</w:t>
-      </w:r>
-    </w:p>
-    <w:p/>
-    <w:p>
-      <w:r>
-        <w:t>Physical Condition at Return</w:t>
-      </w:r>
-    </w:p>
-    <w:p>
-      <w:pPr>
-        <w:pStyle w:val="ListBullet"/>
-      </w:pPr>
-      <w:r>
-        <w:t>[ ] No new visible damage</w:t>
-      </w:r>
-    </w:p>
-    <w:p>
-      <w:pPr>
-        <w:pStyle w:val="ListBullet"/>
-      </w:pPr>
-      <w:r>
-        <w:t>[ ] Normal wear and tear only</w:t>
-      </w:r>
-    </w:p>
-    <w:p>
-      <w:pPr>
-        <w:pStyle w:val="ListBullet"/>
-      </w:pPr>
-      <w:r>
-        <w:t>[ ] New scratches/cracks/dents</w:t>
-      </w:r>
-    </w:p>
-    <w:p>
-      <w:pPr>
-        <w:pStyle w:val="ListBullet"/>
-      </w:pPr>
-      <w:r>
-        <w:t>[ ] Missing accessories</w:t>
-      </w:r>
-    </w:p>
-    <w:p>
-      <w:pPr>
-        <w:pStyle w:val="ListBullet"/>
-      </w:pPr>
-      <w:r>
-        <w:t>[ ] Cleaning required beyond normal use</w:t>
-      </w:r>
-    </w:p>
-    <w:p/>
-    <w:p>
-      <w:r>
-        <w:t>Functional Check at Return</w:t>
-      </w:r>
-    </w:p>
-    <w:p>
-      <w:pPr>
-        <w:pStyle w:val="ListBullet"/>
-      </w:pPr>
-      <w:r>
-        <w:t>[ ] Powers on</w:t>
-      </w:r>
-    </w:p>
-    <w:p>
-      <w:pPr>
-        <w:pStyle w:val="ListBullet"/>
-      </w:pPr>
-      <w:r>
-        <w:t>[ ] Main functions operate normally</w:t>
-      </w:r>
-    </w:p>
-    <w:p>
-      <w:pPr>
-        <w:pStyle w:val="ListBullet"/>
-      </w:pPr>
-      <w:r>
-        <w:t>[ ] Repair needed before next use</w:t>
-      </w:r>
-    </w:p>
-    <w:p/>
-    <w:p>
-      <w:r>
-        <w:t>Difference from Handover Condition</w:t>
-      </w:r>
-    </w:p>
-    <w:p>
-      <w:pPr>
-        <w:pStyle w:val="Heading3"/>
-      </w:pPr>
-      <w:r>
-        <w:t>[DETAILS OR "NONE"]</w:t>
-      </w:r>
-    </w:p>
-    <w:p/>
-    <w:p>
-      <w:r>
-        <w:t>Proposed Deposit Deductions (if any)</w:t>
-      </w:r>
-    </w:p>
-    <w:p>
-      <w:r>
-        <w:t>Unpaid rent: INR [AMOUNT]</w:t>
-      </w:r>
-    </w:p>
-    <w:p>
-      <w:r>
-        <w:t>Damage cost: INR [AMOUNT]</w:t>
-      </w:r>
-    </w:p>
-    <w:p>
-      <w:r>
-        <w:t>Missing accessories: INR [AMOUNT]</w:t>
-      </w:r>
-    </w:p>
-    <w:p>
-      <w:r>
-        <w:t>Other deductions: INR [AMOUNT]</w:t>
-      </w:r>
-    </w:p>
-    <w:p>
-      <w:r>
-        <w:t>Total deductions: INR [AMOUNT]</w:t>
-      </w:r>
-    </w:p>
-    <w:p>
-      <w:r>
-        <w:t>Deposit refund balance: INR [AMOUNT]</w:t>
-      </w:r>
-    </w:p>
-    <w:p>
-      <w:r>
-        <w:t>Refund due date: [DATE]</w:t>
-      </w:r>
-    </w:p>
-    <w:p/>
-    <w:p>
-      <w:pPr>
-        <w:pStyle w:val="Heading2"/>
-      </w:pPr>
-      <w:r>
-        <w:t>E) FINAL SIGN-OFF</w:t>
-      </w:r>
-    </w:p>
-    <w:p>
-      <w:r>
-        <w:t>Owner confirms details above are accurate to the best of knowledge.</w:t>
-      </w:r>
-    </w:p>
-    <w:p>
-      <w:r>
-        <w:t>Renter confirms inspection and acknowledgment of recorded condition.</w:t>
-      </w:r>
-    </w:p>
-    <w:p/>
-    <w:p>
-      <w:r>
-        <w:t>Owner Signature: _____________________   Date: [DATE]</w:t>
-      </w:r>
-    </w:p>
-    <w:p>
-      <w:r>
-        <w:t>Renter Signature: ____________________   Date: [DATE]</w:t>
-      </w:r>
-    </w:p>
-    <w:p/>
-    <w:p>
-      <w:r>
-        <w:t>Witness 1 Signature: _________________   Date: [DATE]</w:t>
-      </w:r>
-    </w:p>
-    <w:p>
-      <w:r>
-        <w:t>Witness 2 Signature: _________________   Date: [DATE]</w:t>
-      </w:r>
-    </w:p>
-    <w:p/>
     <w:sectPr>
       <w:pgSz w:w="12240" w:h="15840"/>
-      <w:pgMar w:top="1440" w:right="1440" w:bottom="1440" w:left="1440" w:header="720" w:footer="720" w:gutter="0"/>
+      <w:pgMar w:top="1152" w:right="1296" w:bottom="1152" w:left="1296" w:header="720" w:footer="720" w:gutter="0"/>
       <w:cols w:space="720"/>
       <w:docGrid w:linePitch="360"/>
     </w:sectPr>
@@ -890,6 +924,9 @@
     <w:name w:val="Normal"/>
     <w:qFormat/>
     <w:rsid w:val="00FC693F"/>
+    <w:pPr>
+      <w:spacing w:after="120" w:line="240" w:lineRule="auto"/>
+    </w:pPr>
     <w:rPr>
       <w:rFonts w:ascii="Calibri" w:hAnsi="Calibri"/>
       <w:sz w:val="22"/>
@@ -954,11 +991,11 @@
       <w:outlineLvl w:val="0"/>
     </w:pPr>
     <w:rPr>
-      <w:rFonts w:asciiTheme="majorHAnsi" w:eastAsiaTheme="majorEastAsia" w:hAnsiTheme="majorHAnsi" w:cstheme="majorBidi" w:ascii="Calibri" w:hAnsi="Calibri"/>
+      <w:rFonts w:asciiTheme="majorHAnsi" w:eastAsiaTheme="majorEastAsia" w:hAnsiTheme="majorHAnsi" w:cstheme="majorBidi"/>
       <w:b/>
       <w:bCs/>
       <w:color w:val="365F91" w:themeColor="accent1" w:themeShade="BF"/>
-      <w:sz w:val="32"/>
+      <w:sz w:val="28"/>
       <w:szCs w:val="28"/>
     </w:rPr>
   </w:style>
@@ -978,7 +1015,7 @@
       <w:outlineLvl w:val="1"/>
     </w:pPr>
     <w:rPr>
-      <w:rFonts w:asciiTheme="majorHAnsi" w:eastAsiaTheme="majorEastAsia" w:hAnsiTheme="majorHAnsi" w:cstheme="majorBidi" w:ascii="Calibri" w:hAnsi="Calibri"/>
+      <w:rFonts w:asciiTheme="majorHAnsi" w:eastAsiaTheme="majorEastAsia" w:hAnsiTheme="majorHAnsi" w:cstheme="majorBidi"/>
       <w:b/>
       <w:bCs/>
       <w:color w:val="4F81BD" w:themeColor="accent1"/>
@@ -1002,11 +1039,10 @@
       <w:outlineLvl w:val="2"/>
     </w:pPr>
     <w:rPr>
-      <w:rFonts w:asciiTheme="majorHAnsi" w:eastAsiaTheme="majorEastAsia" w:hAnsiTheme="majorHAnsi" w:cstheme="majorBidi" w:ascii="Calibri" w:hAnsi="Calibri"/>
+      <w:rFonts w:asciiTheme="majorHAnsi" w:eastAsiaTheme="majorEastAsia" w:hAnsiTheme="majorHAnsi" w:cstheme="majorBidi"/>
       <w:b/>
       <w:bCs/>
       <w:color w:val="4F81BD" w:themeColor="accent1"/>
-      <w:sz w:val="22"/>
     </w:rPr>
   </w:style>
   <w:style w:type="paragraph" w:styleId="Heading4">

</xml_diff>